<commit_message>
Improve annual review output and field highlighting
</commit_message>
<xml_diff>
--- a/app/doc_templates/p2_standard_v1/M05_agm_documents_package_standard.docx
+++ b/app/doc_templates/p2_standard_v1/M05_agm_documents_package_standard.docx
@@ -162,7 +162,7 @@
           <w:b w:val="0"/>
           <w:i w:val="0"/>
         </w:rPr>
-        <w:t>Annual Review Route</w:t>
+        <w:t>Annual Review Method</w:t>
       </w:r>
     </w:p>
     <w:p>
@@ -1783,7 +1783,7 @@
           <w:b w:val="0"/>
           <w:i w:val="0"/>
         </w:rPr>
-        <w:t>Audit / Dormant Status Review</w:t>
+        <w:t>Accounts / Audit Status Review</w:t>
       </w:r>
     </w:p>
     <w:p>
@@ -2140,7 +2140,7 @@
           <w:b w:val="0"/>
           <w:i w:val="0"/>
         </w:rPr>
-        <w:t>Audit / Dormant Status</w:t>
+        <w:t>Accounts / Audit Status</w:t>
       </w:r>
     </w:p>
     <w:p>

</xml_diff>